<commit_message>
Content: blitz pack v2 — 13 live apps only (Joy of Chemistry pre-launch, LifeSci-Shield in dev noted)
Co-Authored-By: Claude Fable 5 <noreply@anthropic.com>
</commit_message>
<xml_diff>
--- a/content/relaunch-2026-07/MASTER-RELAUNCH-BLITZ-PACK.docx
+++ b/content/relaunch-2026-07/MASTER-RELAUNCH-BLITZ-PACK.docx
@@ -535,7 +535,7 @@
         <w:pStyle w:val="Heading1"/>
       </w:pPr>
       <w:r>
-        <w:t>APPENDIX — HEARTBEAT POSTS (one per app: one key message + CTA)</w:t>
+        <w:t>APPENDIX — HEARTBEAT POSTS (one per LIVE app: one key message + CTA)</w:t>
       </w:r>
     </w:p>
     <w:p>
@@ -964,38 +964,6 @@
     </w:p>
     <w:p>
       <w:pPr>
-        <w:pStyle w:val="Heading2"/>
-      </w:pPr>
-      <w:r>
-        <w:t>14. Joy of Chemistry</w:t>
-      </w:r>
-    </w:p>
-    <w:p>
-      <w:r>
-        <w:rPr>
-          <w:b w:val="0"/>
-        </w:rPr>
-        <w:t>HEARTBEAT: Chemistry is magic taught like a tax form. Joy of Chemistry fixes the teaching part.</w:t>
-      </w:r>
-    </w:p>
-    <w:p>
-      <w:r>
-        <w:rPr>
-          <w:b w:val="0"/>
-        </w:rPr>
-        <w:t>CTA: Come see the magic part.  -&gt;  https://joy-of-chemistry.vercel.app</w:t>
-      </w:r>
-    </w:p>
-    <w:p>
-      <w:r>
-        <w:rPr>
-          <w:b w:val="0"/>
-        </w:rPr>
-        <w:t>(LinkedIn/Facebook: link goes in the first comment instead.)</w:t>
-      </w:r>
-    </w:p>
-    <w:p>
-      <w:pPr>
         <w:pStyle w:val="Heading1"/>
       </w:pPr>
       <w:r>
@@ -1039,7 +1007,7 @@
         <w:rPr>
           <w:b w:val="0"/>
         </w:rPr>
-        <w:t>BookMobile is deliberately absent — it gets its own dedicated launch, not a drum beat. RedHorse/MysticCards excluded (archived).</w:t>
+        <w:t>Deliberately absent: BookMobile (gets its own dedicated launch), Joy of Chemistry (not yet launched — its heartbeat joins the rotation on launch day), LifeSci-Shield (still in development), RedHorse/MysticCards (suspended pending the Google billing issue).</w:t>
       </w:r>
     </w:p>
     <w:p>

</xml_diff>